<commit_message>
Import and configure initial tutorial art assets
</commit_message>
<xml_diff>
--- a/Documents/GDD.docx
+++ b/Documents/GDD.docx
@@ -4,6 +4,9 @@
   <w:body>
     <w:p>
       <w:r>
+        <w:rPr>
+          <w:noProof/>
+        </w:rPr>
         <w:drawing>
           <wp:inline distT="0" distB="0" distL="0" distR="0" wp14:anchorId="6E51E630" wp14:editId="19060753">
             <wp:extent cx="5943600" cy="3567430"/>
@@ -41,9 +44,51 @@
         </w:drawing>
       </w:r>
     </w:p>
+    <w:p>
+      <w:r>
+        <w:drawing>
+          <wp:inline distT="0" distB="0" distL="0" distR="0" wp14:anchorId="59ED74C9" wp14:editId="3A225357">
+            <wp:extent cx="5943600" cy="3037840"/>
+            <wp:effectExtent l="0" t="0" r="0" b="0"/>
+            <wp:docPr id="27661839" name="Picture 1"/>
+            <wp:cNvGraphicFramePr>
+              <a:graphicFrameLocks xmlns:a="http://schemas.openxmlformats.org/drawingml/2006/main" noChangeAspect="1"/>
+            </wp:cNvGraphicFramePr>
+            <a:graphic xmlns:a="http://schemas.openxmlformats.org/drawingml/2006/main">
+              <a:graphicData uri="http://schemas.openxmlformats.org/drawingml/2006/picture">
+                <pic:pic xmlns:pic="http://schemas.openxmlformats.org/drawingml/2006/picture">
+                  <pic:nvPicPr>
+                    <pic:cNvPr id="27661839" name=""/>
+                    <pic:cNvPicPr/>
+                  </pic:nvPicPr>
+                  <pic:blipFill>
+                    <a:blip r:embed="rId5"/>
+                    <a:stretch>
+                      <a:fillRect/>
+                    </a:stretch>
+                  </pic:blipFill>
+                  <pic:spPr>
+                    <a:xfrm>
+                      <a:off x="0" y="0"/>
+                      <a:ext cx="5943600" cy="3037840"/>
+                    </a:xfrm>
+                    <a:prstGeom prst="rect">
+                      <a:avLst/>
+                    </a:prstGeom>
+                  </pic:spPr>
+                </pic:pic>
+              </a:graphicData>
+            </a:graphic>
+          </wp:inline>
+        </w:drawing>
+      </w:r>
+    </w:p>
     <w:p/>
     <w:p>
       <w:r>
+        <w:rPr>
+          <w:noProof/>
+        </w:rPr>
         <w:lastRenderedPageBreak/>
         <w:drawing>
           <wp:inline distT="0" distB="0" distL="0" distR="0" wp14:anchorId="1043671D" wp14:editId="36B9812C">
@@ -61,7 +106,7 @@
                     <pic:cNvPicPr/>
                   </pic:nvPicPr>
                   <pic:blipFill>
-                    <a:blip r:embed="rId5"/>
+                    <a:blip r:embed="rId6"/>
                     <a:stretch>
                       <a:fillRect/>
                     </a:stretch>

</xml_diff>